<commit_message>
Major Release of TYE
</commit_message>
<xml_diff>
--- a/Report And Others/TYE_Project_Report_Updated.docx
+++ b/Report And Others/TYE_Project_Report_Updated.docx
@@ -799,7 +799,21 @@
                 <w:sz w:val="20"/>
                 <w:szCs w:val="20"/>
               </w:rPr>
-              <w:t>2023-2-60-117</w:t>
+              <w:t>2023-2-60-</w:t>
+            </w:r>
+            <w:r>
+              <w:rPr>
+                <w:sz w:val="20"/>
+                <w:szCs w:val="20"/>
+              </w:rPr>
+              <w:t>2</w:t>
+            </w:r>
+            <w:r>
+              <w:rPr>
+                <w:sz w:val="20"/>
+                <w:szCs w:val="20"/>
+              </w:rPr>
+              <w:t>17</w:t>
             </w:r>
           </w:p>
         </w:tc>
@@ -7145,7 +7159,23 @@
                 <w:sz w:val="20"/>
                 <w:szCs w:val="20"/>
               </w:rPr>
-              <w:t>As a user, I want to receive a visual alert when my spending in a category approaches or exceeds the defined monthly limit so that I can take corrective action before overspending.</w:t>
+              <w:t xml:space="preserve">As a user, I want to receive a visual alert when my spending in a </w:t>
+            </w:r>
+            <w:proofErr w:type="gramStart"/>
+            <w:r>
+              <w:rPr>
+                <w:sz w:val="20"/>
+                <w:szCs w:val="20"/>
+              </w:rPr>
+              <w:t>category approaches</w:t>
+            </w:r>
+            <w:proofErr w:type="gramEnd"/>
+            <w:r>
+              <w:rPr>
+                <w:sz w:val="20"/>
+                <w:szCs w:val="20"/>
+              </w:rPr>
+              <w:t xml:space="preserve"> or exceeds the defined monthly limit so that I can take corrective action before overspending.</w:t>
             </w:r>
           </w:p>
         </w:tc>
@@ -9622,7 +9652,15 @@
       </w:r>
       <w:proofErr w:type="spellEnd"/>
       <w:r>
-        <w:t xml:space="preserve"> column in both the transactions and budgets tables references the id column of the users table. Cascade deletion </w:t>
+        <w:t xml:space="preserve"> column in both the transactions and budgets tables references the id column of the </w:t>
+      </w:r>
+      <w:proofErr w:type="gramStart"/>
+      <w:r>
+        <w:t>users</w:t>
+      </w:r>
+      <w:proofErr w:type="gramEnd"/>
+      <w:r>
+        <w:t xml:space="preserve"> table. Cascade deletion </w:t>
       </w:r>
       <w:proofErr w:type="spellStart"/>
       <w:r>
@@ -12434,11 +12472,19 @@
       </w:pPr>
       <w:proofErr w:type="spellStart"/>
       <w:r>
-        <w:t>is_paddleocr_available</w:t>
+        <w:t>is_paddleocr_</w:t>
+      </w:r>
+      <w:proofErr w:type="gramStart"/>
+      <w:r>
+        <w:t>available</w:t>
       </w:r>
       <w:proofErr w:type="spellEnd"/>
       <w:r>
-        <w:t xml:space="preserve">(): Returns a </w:t>
+        <w:t>(</w:t>
+      </w:r>
+      <w:proofErr w:type="gramEnd"/>
+      <w:r>
+        <w:t xml:space="preserve">): Returns a </w:t>
       </w:r>
       <w:proofErr w:type="spellStart"/>
       <w:r>
@@ -12486,13 +12532,18 @@
       </w:pPr>
       <w:proofErr w:type="spellStart"/>
       <w:r>
-        <w:t>extract_text_with_details</w:t>
+        <w:t>extract_text_with_</w:t>
+      </w:r>
+      <w:proofErr w:type="gramStart"/>
+      <w:r>
+        <w:t>details</w:t>
       </w:r>
       <w:proofErr w:type="spellEnd"/>
       <w:r>
         <w:t>(</w:t>
       </w:r>
       <w:proofErr w:type="spellStart"/>
+      <w:proofErr w:type="gramEnd"/>
       <w:r>
         <w:t>image_path</w:t>
       </w:r>
@@ -12520,11 +12571,19 @@
       </w:pPr>
       <w:proofErr w:type="spellStart"/>
       <w:r>
-        <w:t>get_ocr_info</w:t>
+        <w:t>get_ocr_</w:t>
+      </w:r>
+      <w:proofErr w:type="gramStart"/>
+      <w:r>
+        <w:t>info</w:t>
       </w:r>
       <w:proofErr w:type="spellEnd"/>
       <w:r>
-        <w:t>(): Returns metadata about the OCR configuration, including the engine name, supported languages, availability status, and pricing information.</w:t>
+        <w:t>(</w:t>
+      </w:r>
+      <w:proofErr w:type="gramEnd"/>
+      <w:r>
+        <w:t>): Returns metadata about the OCR configuration, including the engine name, supported languages, availability status, and pricing information.</w:t>
       </w:r>
     </w:p>
     <w:p>
@@ -12689,7 +12748,15 @@
       </w:r>
       <w:proofErr w:type="spellEnd"/>
       <w:r>
-        <w:t>(text): Examines the first four lines of the receipt text, filters out phone numbers, address-like lines, and purely numeric lines, and returns the first plausible merchant name with a confidence score.</w:t>
+        <w:t xml:space="preserve">(text): Examines the first four lines of the receipt text, filters out phone numbers, address-like lines, and purely numeric lines, and returns the first plausible </w:t>
+      </w:r>
+      <w:proofErr w:type="gramStart"/>
+      <w:r>
+        <w:t>merchant</w:t>
+      </w:r>
+      <w:proofErr w:type="gramEnd"/>
+      <w:r>
+        <w:t xml:space="preserve"> name with a confidence score.</w:t>
       </w:r>
     </w:p>
     <w:p>
@@ -13364,11 +13431,19 @@
       </w:r>
       <w:proofErr w:type="spellStart"/>
       <w:r>
-        <w:t>get_db</w:t>
+        <w:t>get_</w:t>
+      </w:r>
+      <w:proofErr w:type="gramStart"/>
+      <w:r>
+        <w:t>db</w:t>
       </w:r>
       <w:proofErr w:type="spellEnd"/>
       <w:r>
-        <w:t xml:space="preserve">() dependency generator. When a client component (such as the transaction creation endpoint in main.py) requires database access, it calls upon this factory method. The factory handles the creation, configuration (e.g., setting </w:t>
+        <w:t>(</w:t>
+      </w:r>
+      <w:proofErr w:type="gramEnd"/>
+      <w:r>
+        <w:t xml:space="preserve">) dependency generator. When a client component (such as the transaction creation endpoint in main.py) requires database access, it calls upon this factory method. The factory handles the creation, configuration (e.g., setting </w:t>
       </w:r>
       <w:proofErr w:type="spellStart"/>
       <w:r>
@@ -13588,7 +13663,15 @@
         <w:spacing w:before="40" w:after="40" w:line="276" w:lineRule="auto"/>
       </w:pPr>
       <w:r>
-        <w:t>Navigation Bar: Fixed at the top of the viewport, contains the TYE logo, navigation links (Features, How It Works, Reviews), and two call-to-action buttons (Log In and Get Started). The navigation bar becomes opaque with a backdrop blur effect when the user scrolls past the top of the page.</w:t>
+        <w:t xml:space="preserve">Navigation Bar: Fixed at the top of the viewport, contains the TYE logo, navigation links (Features, How It Works, Reviews), and two call-to-action buttons (Log </w:t>
+      </w:r>
+      <w:proofErr w:type="gramStart"/>
+      <w:r>
+        <w:t>In</w:t>
+      </w:r>
+      <w:proofErr w:type="gramEnd"/>
+      <w:r>
+        <w:t xml:space="preserve"> and Get Started). The navigation bar becomes opaque with a backdrop blur effect when the user scrolls past the top of the page.</w:t>
       </w:r>
     </w:p>
     <w:p>
@@ -15468,7 +15551,61 @@
         <w:sz w:val="18"/>
         <w:szCs w:val="18"/>
       </w:rPr>
-      <w:t>TYE — Track Your Expenses  |  Project Report  |  CSE 412  |  East West University</w:t>
+      <w:t xml:space="preserve">TYE — Track Your </w:t>
+    </w:r>
+    <w:proofErr w:type="gramStart"/>
+    <w:r>
+      <w:rPr>
+        <w:color w:val="888888"/>
+        <w:sz w:val="18"/>
+        <w:szCs w:val="18"/>
+      </w:rPr>
+      <w:t>Expenses  |</w:t>
+    </w:r>
+    <w:proofErr w:type="gramEnd"/>
+    <w:r>
+      <w:rPr>
+        <w:color w:val="888888"/>
+        <w:sz w:val="18"/>
+        <w:szCs w:val="18"/>
+      </w:rPr>
+      <w:t xml:space="preserve">  Project </w:t>
+    </w:r>
+    <w:proofErr w:type="gramStart"/>
+    <w:r>
+      <w:rPr>
+        <w:color w:val="888888"/>
+        <w:sz w:val="18"/>
+        <w:szCs w:val="18"/>
+      </w:rPr>
+      <w:t>Report  |</w:t>
+    </w:r>
+    <w:proofErr w:type="gramEnd"/>
+    <w:r>
+      <w:rPr>
+        <w:color w:val="888888"/>
+        <w:sz w:val="18"/>
+        <w:szCs w:val="18"/>
+      </w:rPr>
+      <w:t xml:space="preserve">  CSE </w:t>
+    </w:r>
+    <w:proofErr w:type="gramStart"/>
+    <w:r>
+      <w:rPr>
+        <w:color w:val="888888"/>
+        <w:sz w:val="18"/>
+        <w:szCs w:val="18"/>
+      </w:rPr>
+      <w:t>412  |</w:t>
+    </w:r>
+    <w:proofErr w:type="gramEnd"/>
+    <w:r>
+      <w:rPr>
+        <w:color w:val="888888"/>
+        <w:sz w:val="18"/>
+        <w:szCs w:val="18"/>
+      </w:rPr>
+      <w:t xml:space="preserve">  East West University</w:t>
     </w:r>
   </w:p>
 </w:hdr>

</xml_diff>